<commit_message>
Sacar tecnologías del modelo (dataset final → interfaz)
Las tecnologías se quitan como features del modelo predictivo: su premium
era proxy del contexto (backend/dólar) y como entrada generaban ruido
(ej. "Go" en un rol que no lo usa). Se mantienen en el dataset y en el
EDA (pestaña Tecnologías, H3) como análisis descriptivo.

- predictor_cli / evaluacion_modelos / _usd: features sin tecnologías (9 cols)
- estimador ES/EN y CLI: se quita el selector de tecnologías
- R² 0.30 → 0.27 (RF empata con polinómica); se mantiene RF en producción
- PPT/DOCX y gráficos regenerados en consecuencia

Co-Authored-By: Claude Opus 4.8 <noreply@anthropic.com>
</commit_message>
<xml_diff>
--- a/presentacion/Defensa_TPO.docx
+++ b/presentacion/Defensa_TPO.docx
@@ -1386,7 +1386,7 @@
           <w:color w:val="333333"/>
           <w:sz w:val="22"/>
         </w:rPr>
-        <w:t>Variables de alta cardinalidad: agrupación por frecuencia</w:t>
+        <w:t>Roles de alta cardinalidad y tecnologías</w:t>
       </w:r>
     </w:p>
     <w:p>
@@ -1396,7 +1396,7 @@
           <w:i w:val="0"/>
           <w:sz w:val="22"/>
         </w:rPr>
-        <w:t>El rol y las tecnologías son campos con muchísimos valores distintos (698 roles y 396 tecnologías únicas). Incluirlos todos generaría cientos de columnas con poquísimos casos cada una, que sólo agregan ruido y overfitting. La técnica aplicada:</w:t>
+        <w:t>El rol y las tecnologías son campos con muchísimos valores distintos (698 roles y 396 tecnologías únicas). Se trataron con dos decisiones distintas:</w:t>
       </w:r>
     </w:p>
     <w:p>
@@ -1410,7 +1410,7 @@
         <w:t xml:space="preserve">Roles — agrupación top-N: </w:t>
       </w:r>
       <w:r>
-        <w:t>se conservan los 15 roles más frecuentes y el resto se agrupa en la categoría «Otro». Los 15 principales ya cubren el 90% de los registros; los otros 683 roles suman apenas el 10%, con muy pocos casos cada uno.</w:t>
+        <w:t>se conservan los 15 roles más frecuentes y el resto se agrupa en «Otro». Los 15 principales ya cubren el 90% de los registros; los otros 683 suman apenas el 10%, con muy pocos casos cada uno.</w:t>
       </w:r>
     </w:p>
     <w:p>
@@ -1421,10 +1421,10 @@
         <w:rPr>
           <w:b/>
         </w:rPr>
-        <w:t xml:space="preserve">Tecnologías — multi-hot de los más frecuentes: </w:t>
+        <w:t xml:space="preserve">Tecnologías — EXCLUIDAS del modelo: </w:t>
       </w:r>
       <w:r>
-        <w:t>se crea una variable binaria sólo para las 20 tecnologías más mencionadas, que concentran el 97% de las menciones; las 376 restantes aportan el 3%.</w:t>
+        <w:t>como features individuales generaban ruido y extrapolación en perfiles atípicos (poner «Go» en un helpdesk inflaba la predicción hacia una combinación que no existe en los datos), y su premium es en realidad un proxy del contexto laboral (backend/infra, empresas dolarizadas), no un efecto del lenguaje. Quitarlas casi no afecta el desempeño (el R² baja de 0,30 a 0,27) y da un modelo más robusto. El análisis descriptivo de tecnologías se conserva en el EDA (hipótesis H3).</w:t>
       </w:r>
     </w:p>
     <w:p>
@@ -1434,7 +1434,7 @@
           <w:i w:val="0"/>
           <w:sz w:val="22"/>
         </w:rPr>
-        <w:t>Los valores que se agrupan no son relevantes porque son estadísticamente marginales: aparecen tan pocas veces que el modelo no podría aprender de ellos un patrón confiable, y en cambio incorporaría ruido. Agruparlos concentra la señal sin perder capacidad predictiva —de hecho, el R² se mantiene—. La curva de Pareto lo muestra con claridad: unos pocos roles/tecnologías concentran casi todo, y el resto es una cola larga.</w:t>
+        <w:t>Agrupar los roles concentra la señal sin perder capacidad predictiva. La curva de Pareto lo muestra: unos pocos roles/tecnologías concentran casi todo, y el resto es una cola larga.</w:t>
       </w:r>
     </w:p>
     <w:p>
@@ -1803,7 +1803,7 @@
               <w:rPr>
                 <w:sz w:val="20"/>
               </w:rPr>
-              <w:t>0.24</w:t>
+              <w:t>0.22</w:t>
             </w:r>
           </w:p>
         </w:tc>
@@ -1817,7 +1817,7 @@
               <w:rPr>
                 <w:sz w:val="20"/>
               </w:rPr>
-              <w:t>$2,05 M</w:t>
+              <w:t>$2,07 M</w:t>
             </w:r>
           </w:p>
         </w:tc>
@@ -1861,7 +1861,7 @@
               <w:rPr>
                 <w:sz w:val="20"/>
               </w:rPr>
-              <w:t>0.29</w:t>
+              <w:t>0.28</w:t>
             </w:r>
           </w:p>
         </w:tc>
@@ -1875,7 +1875,7 @@
               <w:rPr>
                 <w:sz w:val="20"/>
               </w:rPr>
-              <w:t>$1,98 M</w:t>
+              <w:t>$1,99 M</w:t>
             </w:r>
           </w:p>
         </w:tc>
@@ -1919,7 +1919,7 @@
               <w:rPr>
                 <w:sz w:val="20"/>
               </w:rPr>
-              <w:t>0.22</w:t>
+              <w:t>0.20</w:t>
             </w:r>
           </w:p>
         </w:tc>
@@ -1933,7 +1933,7 @@
               <w:rPr>
                 <w:sz w:val="20"/>
               </w:rPr>
-              <w:t>$2,08 M</w:t>
+              <w:t>$2,10 M</w:t>
             </w:r>
           </w:p>
         </w:tc>
@@ -1977,7 +1977,7 @@
               <w:rPr>
                 <w:sz w:val="20"/>
               </w:rPr>
-              <w:t>0.30</w:t>
+              <w:t>0.27</w:t>
             </w:r>
           </w:p>
         </w:tc>
@@ -1991,7 +1991,7 @@
               <w:rPr>
                 <w:sz w:val="20"/>
               </w:rPr>
-              <w:t>$1,97 M</w:t>
+              <w:t>$2,00 M</w:t>
             </w:r>
           </w:p>
         </w:tc>
@@ -2029,7 +2029,7 @@
           <w:i w:val="0"/>
           <w:sz w:val="22"/>
         </w:rPr>
-        <w:t>Se eligió por cinco razones: (1) mejor desempeño en test (R²≈0,30; MAE $1,42 M); (2) captura no linealidades e interacciones sin ingeniería manual —por ejemplo, el rendimiento decreciente de la experiencia—; (3) es robusto a outliers y a la mezcla de escalas, y no requiere estandarización; (4) regularizado (profundidad máxima y mínimo de hojas) no presenta overfitting (train ≈ test); y (5) entrega la importancia de cada variable, aportando interpretabilidad para la lectura de negocio. Frente a los modelos lineales (que no capturan interacciones) y al árbol único (inestable y propenso a overfitting), el bosque ofrece el mejor balance entre precisión, robustez e interpretabilidad.</w:t>
+        <w:t>El Random Forest y la regresión polinómica empatan en test (R²≈0,27–0,28). Se eligió el Random Forest por cuatro razones: (1) captura no linealidades e interacciones sin ingeniería manual —por ejemplo, el rendimiento decreciente de la experiencia—; (2) es robusto a outliers y a la mezcla de escalas, y no requiere estandarización; (3) regularizado no presenta overfitting (train ≈ test); y (4) entrega la importancia de cada variable, aportando interpretabilidad para la lectura de negocio. Frente a los lineales (que no capturan interacciones) y al árbol único (inestable), el bosque ofrece el mejor balance entre robustez e interpretabilidad.</w:t>
       </w:r>
     </w:p>
     <w:p>
@@ -2091,7 +2091,7 @@
           <w:i w:val="0"/>
           <w:sz w:val="22"/>
         </w:rPr>
-        <w:t>Las variables más predictivas son la experiencia, la edad, el uso de Go, el rol de liderazgo y trabajar en CABA. El techo de ~0,30 es esperable y honesto: cerca de dos tercios de la variación dependen de factores no encuestados (empresa puntual, negociación). La validación temporal (R²=0,30) es muy cercana a la aleatoria (R²=0,33): el modelo generaliza bien al presente.</w:t>
+        <w:t>Las variables más predictivas son la experiencia, la edad, el rol de liderazgo, la provincia (CABA) y el tamaño de empresa. El techo de ~0,27 es esperable y honesto: cerca de dos tercios de la variación dependen de factores no encuestados (empresa puntual, negociación). La validación temporal (R²≈0,27) es muy cercana a la aleatoria (R²≈0,29): el modelo generaliza bien al presente.</w:t>
       </w:r>
     </w:p>
     <w:p>

</xml_diff>

<commit_message>
Fuentes crudas versionadas en parquet + README desarrollado + hipótesis sin inflación
- data/raw: gemelo .parquet lossless de cada CSV crudo (140 MB → 11 MB el de
  Stack Overflow); fuentes_raw.py convierte y provee leer_csv/existe con
  fallback automático. El pipeline completo corre con un clon del repo sin
  ningún CSV (verificado: dataset resultante idéntico).
- README: desarrollado en base al documento de defensa (hipótesis H1–H6,
  fuentes, metodología, modelos, apps, reproducibilidad). Se quita la
  inflación de la hipótesis.
- Defensa (PPT 21 slides + DOCX): se elimina la hipótesis de inflación (H5)
  y la slide/sección de evolución del poder de compra; se renumeran H6→H5 y
  H7→H6; resultados pasan a brechas/región; nota de reproducibilidad parquet.
  Generadores versionados en presentacion/.

Co-Authored-By: Claude Opus 4.8 <noreply@anthropic.com>
</commit_message>
<xml_diff>
--- a/presentacion/Defensa_TPO.docx
+++ b/presentacion/Defensa_TPO.docx
@@ -123,7 +123,7 @@
           <w:i/>
           <w:sz w:val="22"/>
         </w:rPr>
-        <w:t>Hallazgo central: el perfil explica alrededor del 30% de la variación salarial —la experiencia y el rol de liderazgo son dominantes—, el poder adquisitivo real quedó estancado pese a sueldos nominales diez veces mayores y, contra la intuición, cobrar en dólares no aportó mayor estabilidad en el período.</w:t>
+        <w:t>Hallazgo central: el perfil explica alrededor del 27% de la variación salarial —la experiencia y el rol de liderazgo son dominantes— y, contra la intuición, cobrar en dólares no aportó mayor estabilidad en el período.</w:t>
       </w:r>
     </w:p>
     <w:p>
@@ -475,7 +475,7 @@
           <w:i/>
           <w:sz w:val="22"/>
         </w:rPr>
-        <w:t>El sueldo real de un profesional tech está determinado por su perfil laboral (rol, seniority, experiencia, tecnologías) y su contexto geográfico (provincia, modalidad), una vez ajustado por el contexto macroeconómico (inflación, tipo de cambio real, competitividad).</w:t>
+        <w:t>El sueldo real de un profesional tech está determinado por su perfil laboral (rol, experiencia) y su contexto (provincia, modalidad, tamaño de empresa), una vez expresado en moneda constante para que las ediciones sean comparables entre sí.</w:t>
       </w:r>
     </w:p>
     <w:p>
@@ -677,7 +677,7 @@
               <w:rPr>
                 <w:sz w:val="20"/>
               </w:rPr>
-              <w:t>Un nominal más alto no implica mejor poder adquisitivo real.</w:t>
+              <w:t>Quienes cobran en dólares tienen poder de compra más estable.</w:t>
             </w:r>
           </w:p>
         </w:tc>
@@ -694,36 +694,6 @@
                 <w:sz w:val="20"/>
               </w:rPr>
               <w:t>H6</w:t>
-            </w:r>
-          </w:p>
-        </w:tc>
-        <w:tc>
-          <w:tcPr>
-            <w:tcW w:type="dxa" w:w="4320"/>
-          </w:tcPr>
-          <w:p>
-            <w:r/>
-            <w:r>
-              <w:rPr>
-                <w:sz w:val="20"/>
-              </w:rPr>
-              <w:t>Quienes cobran en dólares tienen poder de compra más estable.</w:t>
-            </w:r>
-          </w:p>
-        </w:tc>
-      </w:tr>
-      <w:tr>
-        <w:tc>
-          <w:tcPr>
-            <w:tcW w:type="dxa" w:w="4320"/>
-          </w:tcPr>
-          <w:p>
-            <w:r/>
-            <w:r>
-              <w:rPr>
-                <w:sz w:val="20"/>
-              </w:rPr>
-              <w:t>H7</w:t>
             </w:r>
           </w:p>
         </w:tc>
@@ -795,7 +765,7 @@
         <w:pStyle w:val="ListBullet"/>
       </w:pPr>
       <w:r>
-        <w:t>Lectura del impacto macro (inflación y dólar) sobre el costo del talento.</w:t>
+        <w:t>Lectura del impacto macro (dólar y tipo de cambio real) sobre el costo del talento.</w:t>
       </w:r>
     </w:p>
     <w:p>
@@ -1152,6 +1122,16 @@
       </w:tr>
     </w:tbl>
     <w:p>
+      <w:r>
+        <w:rPr>
+          <w:b w:val="0"/>
+          <w:i/>
+          <w:sz w:val="22"/>
+        </w:rPr>
+        <w:t>Reproducibilidad: los CSV crudos no viajan con el repositorio (el de Stack Overflow pesa 140 MB, por encima del límite de GitHub), pero cada fuente tiene un gemelo .parquet liviano versionado en data/raw/ (140 MB → 11 MB). El pipeline los usa automáticamente si el CSV no está, de modo que cualquier integrante reproduce todo el trabajo con un simple clon del repositorio.</w:t>
+      </w:r>
+    </w:p>
+    <w:p>
       <w:pPr>
         <w:pStyle w:val="Heading1"/>
       </w:pPr>
@@ -1271,10 +1251,10 @@
         <w:rPr>
           <w:b/>
         </w:rPr>
-        <w:t xml:space="preserve">Multi-hot de tecnologías (top 20): </w:t>
+        <w:t xml:space="preserve">Tecnologías — excluidas como features: </w:t>
       </w:r>
       <w:r>
-        <w:t>el campo es texto libre multivaluado («python, sql, java»). Se generó una variable binaria por tecnología frecuente. Justificación: permite que el modelo capte el premium de cada tecnología por separado; un campo de texto no es utilizable directamente.</w:t>
+        <w:t>el campo multivaluado se evaluó como multi-hot (top 20), pero se excluyó del modelo final porque su premium es un proxy del contexto y generaba ruido en perfiles atípicos (detalle en «Roles de alta cardinalidad y tecnologías»). El análisis descriptivo se conserva en el EDA.</w:t>
       </w:r>
     </w:p>
     <w:p>
@@ -2777,50 +2757,6 @@
               <w:rPr>
                 <w:sz w:val="20"/>
               </w:rPr>
-              <w:t>Confirmada</w:t>
-            </w:r>
-          </w:p>
-        </w:tc>
-        <w:tc>
-          <w:tcPr>
-            <w:tcW w:type="dxa" w:w="2880"/>
-          </w:tcPr>
-          <w:p>
-            <w:r/>
-            <w:r>
-              <w:rPr>
-                <w:sz w:val="20"/>
-              </w:rPr>
-              <w:t>Brecha nominal–real promedio de −62%.</w:t>
-            </w:r>
-          </w:p>
-        </w:tc>
-      </w:tr>
-      <w:tr>
-        <w:tc>
-          <w:tcPr>
-            <w:tcW w:type="dxa" w:w="2880"/>
-          </w:tcPr>
-          <w:p>
-            <w:r/>
-            <w:r>
-              <w:rPr>
-                <w:sz w:val="20"/>
-              </w:rPr>
-              <w:t>H6</w:t>
-            </w:r>
-          </w:p>
-        </w:tc>
-        <w:tc>
-          <w:tcPr>
-            <w:tcW w:type="dxa" w:w="2880"/>
-          </w:tcPr>
-          <w:p>
-            <w:r/>
-            <w:r>
-              <w:rPr>
-                <w:sz w:val="20"/>
-              </w:rPr>
               <w:t>Refutada</w:t>
             </w:r>
           </w:p>
@@ -2851,7 +2787,7 @@
               <w:rPr>
                 <w:sz w:val="20"/>
               </w:rPr>
-              <w:t>H7</w:t>
+              <w:t>H6</w:t>
             </w:r>
           </w:p>
         </w:tc>
@@ -2893,7 +2829,7 @@
           <w:color w:val="333333"/>
           <w:sz w:val="22"/>
         </w:rPr>
-        <w:t>Brechas salariales, inflación y comparativa regional</w:t>
+        <w:t>Brechas salariales y comparativa regional</w:t>
       </w:r>
     </w:p>
     <w:p>
@@ -2903,7 +2839,7 @@
       <w:r>
         <w:drawing>
           <wp:inline xmlns:a="http://schemas.openxmlformats.org/drawingml/2006/main" xmlns:pic="http://schemas.openxmlformats.org/drawingml/2006/picture">
-            <wp:extent cx="5486400" cy="2450390"/>
+            <wp:extent cx="5486400" cy="3965770"/>
             <wp:docPr id="6" name="Picture 6"/>
             <wp:cNvGraphicFramePr>
               <a:graphicFrameLocks noChangeAspect="1"/>
@@ -2912,7 +2848,7 @@
               <a:graphicData uri="http://schemas.openxmlformats.org/drawingml/2006/picture">
                 <pic:pic>
                   <pic:nvPicPr>
-                    <pic:cNvPr id="0" name="eda_06_poder_adquisitivo.png"/>
+                    <pic:cNvPr id="0" name="eda_05_geografia.png"/>
                     <pic:cNvPicPr/>
                   </pic:nvPicPr>
                   <pic:blipFill>
@@ -2924,7 +2860,7 @@
                   <pic:spPr>
                     <a:xfrm>
                       <a:off x="0" y="0"/>
-                      <a:ext cx="5486400" cy="2450390"/>
+                      <a:ext cx="5486400" cy="3965770"/>
                     </a:xfrm>
                     <a:prstGeom prst="rect"/>
                   </pic:spPr>
@@ -2945,7 +2881,7 @@
           <w:i/>
           <w:sz w:val="18"/>
         </w:rPr>
-        <w:t>Figura 5. Salario nominal vs real y brecha por registro.</w:t>
+        <w:t>Figura 5. Salario real mediano por provincia.</w:t>
       </w:r>
     </w:p>
     <w:p>
@@ -2955,80 +2891,7 @@
           <w:i w:val="0"/>
           <w:sz w:val="22"/>
         </w:rPr>
-        <w:t>El número nominal creció diez veces, pero casi todo fue inflación: en pesos reales el poder de compra se mantuvo estancado (brecha −62%). En lo regional, CABA y las grandes empresas pagan más, y el stack backend (Go/Rust) concentra el premium. Contra la creencia general, cobrar en dólares no dio más estabilidad: el dólar protege de la inflación pero expone a la apreciación real del peso —fue escudo en 2022–2023 y lastre en 2024–2026—.</w:t>
-      </w:r>
-    </w:p>
-    <w:p>
-      <w:r>
-        <w:rPr>
-          <w:b/>
-          <w:i w:val="0"/>
-          <w:color w:val="333333"/>
-          <w:sz w:val="22"/>
-        </w:rPr>
-        <w:t>Evolución del poder de compra en el tiempo</w:t>
-      </w:r>
-    </w:p>
-    <w:p>
-      <w:pPr>
-        <w:jc w:val="center"/>
-      </w:pPr>
-      <w:r>
-        <w:drawing>
-          <wp:inline xmlns:a="http://schemas.openxmlformats.org/drawingml/2006/main" xmlns:pic="http://schemas.openxmlformats.org/drawingml/2006/picture">
-            <wp:extent cx="5486400" cy="2516919"/>
-            <wp:docPr id="7" name="Picture 7"/>
-            <wp:cNvGraphicFramePr>
-              <a:graphicFrameLocks noChangeAspect="1"/>
-            </wp:cNvGraphicFramePr>
-            <a:graphic>
-              <a:graphicData uri="http://schemas.openxmlformats.org/drawingml/2006/picture">
-                <pic:pic>
-                  <pic:nvPicPr>
-                    <pic:cNvPr id="0" name="evolucion_indices.png"/>
-                    <pic:cNvPicPr/>
-                  </pic:nvPicPr>
-                  <pic:blipFill>
-                    <a:blip r:embed="rId15"/>
-                    <a:stretch>
-                      <a:fillRect/>
-                    </a:stretch>
-                  </pic:blipFill>
-                  <pic:spPr>
-                    <a:xfrm>
-                      <a:off x="0" y="0"/>
-                      <a:ext cx="5486400" cy="2516919"/>
-                    </a:xfrm>
-                    <a:prstGeom prst="rect"/>
-                  </pic:spPr>
-                </pic:pic>
-              </a:graphicData>
-            </a:graphic>
-          </wp:inline>
-        </w:drawing>
-      </w:r>
-    </w:p>
-    <w:p>
-      <w:pPr>
-        <w:jc w:val="center"/>
-      </w:pPr>
-      <w:r>
-        <w:rPr>
-          <w:b w:val="0"/>
-          <w:i/>
-          <w:sz w:val="18"/>
-        </w:rPr>
-        <w:t>Figura 6. Salario medido en distintas varas (base 2022.2 = 100).</w:t>
-      </w:r>
-    </w:p>
-    <w:p>
-      <w:r>
-        <w:rPr>
-          <w:b w:val="0"/>
-          <w:i w:val="0"/>
-          <w:sz w:val="22"/>
-        </w:rPr>
-        <w:t>Medido en distintas «varas» (base 2022.2 = 100), el poder de compra del salario tocó un pico en enero 2024 tras la devaluación —el ratio contra el salario formal (RIPTE) saltó a 169, es decir, los profesionales tech se despegaron del resto del mercado— y se recuperó hacia 2025.2. Medido en canastas básicas quedó más apretado. El Big Mac se descartó de esta comparación por ser un dato anual desactualizado que distorsiona la serie.</w:t>
+        <w:t>La brecha junior → senior es de casi 3× y la de liderazgo es la mayor entre roles (+0,19 en log-salario). En lo regional, CABA paga un 24% más que el interior, la Patagonia destaca por el polo energético, y las grandes empresas y el stack backend concentran el premium. Contra la creencia general, cobrar en dólares no dio un poder de compra más estable: los dolarizados mostraron más volatilidad real que los pesificados —el dólar fue escudo en 2022–2023 y lastre en 2024–2026— (H5 refutada).</w:t>
       </w:r>
     </w:p>
     <w:p>
@@ -3050,7 +2913,7 @@
         <w:drawing>
           <wp:inline xmlns:a="http://schemas.openxmlformats.org/drawingml/2006/main" xmlns:pic="http://schemas.openxmlformats.org/drawingml/2006/picture">
             <wp:extent cx="5486400" cy="2654791"/>
-            <wp:docPr id="8" name="Picture 8"/>
+            <wp:docPr id="7" name="Picture 7"/>
             <wp:cNvGraphicFramePr>
               <a:graphicFrameLocks noChangeAspect="1"/>
             </wp:cNvGraphicFramePr>
@@ -3062,7 +2925,7 @@
                     <pic:cNvPicPr/>
                   </pic:nvPicPr>
                   <pic:blipFill>
-                    <a:blip r:embed="rId16"/>
+                    <a:blip r:embed="rId15"/>
                     <a:stretch>
                       <a:fillRect/>
                     </a:stretch>
@@ -3091,7 +2954,7 @@
           <w:i/>
           <w:sz w:val="18"/>
         </w:rPr>
-        <w:t>Figura 7. Salario mediano de developers por país (USD/mes).</w:t>
+        <w:t>Figura 6. Salario mediano de developers por país (USD/mes).</w:t>
       </w:r>
     </w:p>
     <w:p>
@@ -3167,15 +3030,7 @@
         <w:pStyle w:val="ListBullet"/>
       </w:pPr>
       <w:r>
-        <w:t>El perfil explica ~30% del sueldo; experiencia y rol de liderazgo son lo decisivo.</w:t>
-      </w:r>
-    </w:p>
-    <w:p>
-      <w:pPr>
-        <w:pStyle w:val="ListBullet"/>
-      </w:pPr>
-      <w:r>
-        <w:t>El poder adquisitivo real quedó estancado pese a nominales 10× mayores.</w:t>
+        <w:t>El perfil explica ~27% del sueldo; experiencia y rol de liderazgo son lo decisivo.</w:t>
       </w:r>
     </w:p>
     <w:p>
@@ -3297,7 +3152,7 @@
         <w:t xml:space="preserve">Hipótesis: </w:t>
       </w:r>
       <w:r>
-        <w:t>Enunciar H1–H7.</w:t>
+        <w:t>Enunciar H1–H6.</w:t>
       </w:r>
     </w:p>
     <w:p>
@@ -3367,7 +3222,7 @@
         <w:t xml:space="preserve">Feature engineering: </w:t>
       </w:r>
       <w:r>
-        <w:t>Foco: multi-hot, agrupaciones, target real, anti-leakage.</w:t>
+        <w:t>Foco: agrupaciones, target real, anti-leakage, techs excluidas.</w:t>
       </w:r>
     </w:p>
     <w:p>
@@ -3493,7 +3348,7 @@
         <w:t xml:space="preserve">Resultados: </w:t>
       </w:r>
       <w:r>
-        <w:t>H1–H7, inflación (−62%), regional y dolarización (H6 refutada).</w:t>
+        <w:t>H1–H6, brechas, regional y dolarización (H5 refutada).</w:t>
       </w:r>
     </w:p>
     <w:p>

</xml_diff>